<commit_message>
modified the difference exercise
</commit_message>
<xml_diff>
--- a/deepskilling_hands_on_exercises/week-2/Spring-Data-JPA-Spring-Boot-Hibernate/JPA_vs_Hibernate_vs_SpringDataJPA.docx
+++ b/deepskilling_hands_on_exercises/week-2/Spring-Data-JPA-Spring-Boot-Hibernate/JPA_vs_Hibernate_vs_SpringDataJPA.docx
@@ -19,26 +19,6 @@
           <w:szCs w:val="28"/>
         </w:rPr>
         <w:t>JPA vs Hibernate vs Spring Data JPA</w:t>
-      </w:r>
-    </w:p>
-    <w:p>
-      <w:pPr>
-        <w:spacing w:after="300"/>
-        <w:rPr>
-          <w:sz w:val="28"/>
-          <w:szCs w:val="28"/>
-        </w:rPr>
-      </w:pPr>
-      <w:r>
-        <w:rPr>
-          <w:rFonts w:eastAsia="Calibri"/>
-          <w:i/>
-          <w:iCs/>
-          <w:color w:val="555555"/>
-          <w:sz w:val="28"/>
-          <w:szCs w:val="28"/>
-        </w:rPr>
-        <w:t>A quick reference for understanding how these three relate to each other.</w:t>
       </w:r>
     </w:p>
     <w:p>
@@ -906,22 +886,22 @@
           <w:sz w:val="28"/>
           <w:szCs w:val="28"/>
         </w:rPr>
+        <w:t xml:space="preserve">       ↓ (implemented by)</w:t>
+      </w:r>
+      <w:r>
+        <w:rPr>
+          <w:sz w:val="28"/>
+          <w:szCs w:val="28"/>
+        </w:rPr>
+        <w:br/>
+      </w:r>
+      <w:r>
+        <w:rPr>
+          <w:rFonts w:eastAsia="Consolas"/>
+          <w:sz w:val="28"/>
+          <w:szCs w:val="28"/>
+        </w:rPr>
         <w:lastRenderedPageBreak/>
-        <w:t xml:space="preserve">       ↓ (implemented by)</w:t>
-      </w:r>
-      <w:r>
-        <w:rPr>
-          <w:sz w:val="28"/>
-          <w:szCs w:val="28"/>
-        </w:rPr>
-        <w:br/>
-      </w:r>
-      <w:r>
-        <w:rPr>
-          <w:rFonts w:eastAsia="Consolas"/>
-          <w:sz w:val="28"/>
-          <w:szCs w:val="28"/>
-        </w:rPr>
         <w:t xml:space="preserve">  Hibernate         </w:t>
       </w:r>
       <w:proofErr w:type="gramStart"/>
@@ -1871,7 +1851,6 @@
           <w:sz w:val="28"/>
           <w:szCs w:val="28"/>
         </w:rPr>
-        <w:lastRenderedPageBreak/>
         <w:t xml:space="preserve">public void </w:t>
       </w:r>
       <w:proofErr w:type="spellStart"/>
@@ -1915,6 +1894,7 @@
           <w:sz w:val="28"/>
           <w:szCs w:val="28"/>
         </w:rPr>
+        <w:lastRenderedPageBreak/>
         <w:t xml:space="preserve">    </w:t>
       </w:r>
       <w:proofErr w:type="spellStart"/>
@@ -2166,7 +2146,6 @@
         <w:tc>
           <w:tcPr>
             <w:tcW w:w="2200" w:type="dxa"/>
-            <w:shd w:val="clear" w:color="auto" w:fill="1F4E79"/>
             <w:tcMar>
               <w:top w:w="100" w:type="dxa"/>
               <w:left w:w="120" w:type="dxa"/>
@@ -2186,7 +2165,6 @@
                 <w:rFonts w:eastAsia="Calibri"/>
                 <w:b/>
                 <w:bCs/>
-                <w:color w:val="FFFFFF"/>
                 <w:sz w:val="28"/>
                 <w:szCs w:val="28"/>
               </w:rPr>
@@ -2197,7 +2175,6 @@
         <w:tc>
           <w:tcPr>
             <w:tcW w:w="2500" w:type="dxa"/>
-            <w:shd w:val="clear" w:color="auto" w:fill="1F4E79"/>
             <w:tcMar>
               <w:top w:w="100" w:type="dxa"/>
               <w:left w:w="120" w:type="dxa"/>
@@ -2217,7 +2194,6 @@
                 <w:rFonts w:eastAsia="Calibri"/>
                 <w:b/>
                 <w:bCs/>
-                <w:color w:val="FFFFFF"/>
                 <w:sz w:val="28"/>
                 <w:szCs w:val="28"/>
               </w:rPr>
@@ -2228,7 +2204,6 @@
         <w:tc>
           <w:tcPr>
             <w:tcW w:w="2900" w:type="dxa"/>
-            <w:shd w:val="clear" w:color="auto" w:fill="1F4E79"/>
             <w:tcMar>
               <w:top w:w="100" w:type="dxa"/>
               <w:left w:w="120" w:type="dxa"/>
@@ -2248,7 +2223,6 @@
                 <w:rFonts w:eastAsia="Calibri"/>
                 <w:b/>
                 <w:bCs/>
-                <w:color w:val="FFFFFF"/>
                 <w:sz w:val="28"/>
                 <w:szCs w:val="28"/>
               </w:rPr>
@@ -2259,7 +2233,6 @@
         <w:tc>
           <w:tcPr>
             <w:tcW w:w="3200" w:type="dxa"/>
-            <w:shd w:val="clear" w:color="auto" w:fill="1F4E79"/>
             <w:tcMar>
               <w:top w:w="100" w:type="dxa"/>
               <w:left w:w="120" w:type="dxa"/>
@@ -2279,7 +2252,6 @@
                 <w:rFonts w:eastAsia="Calibri"/>
                 <w:b/>
                 <w:bCs/>
-                <w:color w:val="FFFFFF"/>
                 <w:sz w:val="28"/>
                 <w:szCs w:val="28"/>
               </w:rPr>
@@ -2292,7 +2264,6 @@
         <w:tc>
           <w:tcPr>
             <w:tcW w:w="2200" w:type="dxa"/>
-            <w:shd w:val="clear" w:color="auto" w:fill="FFFFFF"/>
             <w:tcMar>
               <w:top w:w="100" w:type="dxa"/>
               <w:left w:w="120" w:type="dxa"/>
@@ -2312,7 +2283,6 @@
                 <w:rFonts w:eastAsia="Calibri"/>
                 <w:b/>
                 <w:bCs/>
-                <w:color w:val="000000"/>
                 <w:sz w:val="28"/>
                 <w:szCs w:val="28"/>
               </w:rPr>
@@ -2323,7 +2293,6 @@
         <w:tc>
           <w:tcPr>
             <w:tcW w:w="2500" w:type="dxa"/>
-            <w:shd w:val="clear" w:color="auto" w:fill="FFFFFF"/>
             <w:tcMar>
               <w:top w:w="100" w:type="dxa"/>
               <w:left w:w="120" w:type="dxa"/>
@@ -2341,7 +2310,6 @@
             <w:r>
               <w:rPr>
                 <w:rFonts w:eastAsia="Calibri"/>
-                <w:color w:val="000000"/>
                 <w:sz w:val="28"/>
                 <w:szCs w:val="28"/>
               </w:rPr>
@@ -2352,7 +2320,6 @@
         <w:tc>
           <w:tcPr>
             <w:tcW w:w="2900" w:type="dxa"/>
-            <w:shd w:val="clear" w:color="auto" w:fill="FFFFFF"/>
             <w:tcMar>
               <w:top w:w="100" w:type="dxa"/>
               <w:left w:w="120" w:type="dxa"/>
@@ -2370,7 +2337,6 @@
             <w:r>
               <w:rPr>
                 <w:rFonts w:eastAsia="Calibri"/>
-                <w:color w:val="000000"/>
                 <w:sz w:val="28"/>
                 <w:szCs w:val="28"/>
               </w:rPr>
@@ -2381,7 +2347,6 @@
         <w:tc>
           <w:tcPr>
             <w:tcW w:w="3200" w:type="dxa"/>
-            <w:shd w:val="clear" w:color="auto" w:fill="FFFFFF"/>
             <w:tcMar>
               <w:top w:w="100" w:type="dxa"/>
               <w:left w:w="120" w:type="dxa"/>
@@ -2399,7 +2364,6 @@
             <w:r>
               <w:rPr>
                 <w:rFonts w:eastAsia="Calibri"/>
-                <w:color w:val="000000"/>
                 <w:sz w:val="28"/>
                 <w:szCs w:val="28"/>
               </w:rPr>
@@ -2412,7 +2376,6 @@
         <w:tc>
           <w:tcPr>
             <w:tcW w:w="2200" w:type="dxa"/>
-            <w:shd w:val="clear" w:color="auto" w:fill="FFFFFF"/>
             <w:tcMar>
               <w:top w:w="100" w:type="dxa"/>
               <w:left w:w="120" w:type="dxa"/>
@@ -2432,7 +2395,6 @@
                 <w:rFonts w:eastAsia="Calibri"/>
                 <w:b/>
                 <w:bCs/>
-                <w:color w:val="000000"/>
                 <w:sz w:val="28"/>
                 <w:szCs w:val="28"/>
               </w:rPr>
@@ -2443,7 +2405,6 @@
         <w:tc>
           <w:tcPr>
             <w:tcW w:w="2500" w:type="dxa"/>
-            <w:shd w:val="clear" w:color="auto" w:fill="FFFFFF"/>
             <w:tcMar>
               <w:top w:w="100" w:type="dxa"/>
               <w:left w:w="120" w:type="dxa"/>
@@ -2461,7 +2422,6 @@
             <w:r>
               <w:rPr>
                 <w:rFonts w:eastAsia="Calibri"/>
-                <w:color w:val="000000"/>
                 <w:sz w:val="28"/>
                 <w:szCs w:val="28"/>
               </w:rPr>
@@ -2472,7 +2432,6 @@
         <w:tc>
           <w:tcPr>
             <w:tcW w:w="2900" w:type="dxa"/>
-            <w:shd w:val="clear" w:color="auto" w:fill="FFFFFF"/>
             <w:tcMar>
               <w:top w:w="100" w:type="dxa"/>
               <w:left w:w="120" w:type="dxa"/>
@@ -2490,7 +2449,6 @@
             <w:r>
               <w:rPr>
                 <w:rFonts w:eastAsia="Calibri"/>
-                <w:color w:val="000000"/>
                 <w:sz w:val="28"/>
                 <w:szCs w:val="28"/>
               </w:rPr>
@@ -2501,7 +2459,6 @@
         <w:tc>
           <w:tcPr>
             <w:tcW w:w="3200" w:type="dxa"/>
-            <w:shd w:val="clear" w:color="auto" w:fill="FFFFFF"/>
             <w:tcMar>
               <w:top w:w="100" w:type="dxa"/>
               <w:left w:w="120" w:type="dxa"/>
@@ -2519,7 +2476,6 @@
             <w:r>
               <w:rPr>
                 <w:rFonts w:eastAsia="Calibri"/>
-                <w:color w:val="000000"/>
                 <w:sz w:val="28"/>
                 <w:szCs w:val="28"/>
               </w:rPr>
@@ -2529,7 +2485,6 @@
             <w:r>
               <w:rPr>
                 <w:rFonts w:eastAsia="Calibri"/>
-                <w:color w:val="000000"/>
                 <w:sz w:val="28"/>
                 <w:szCs w:val="28"/>
               </w:rPr>
@@ -2539,7 +2494,6 @@
             <w:r>
               <w:rPr>
                 <w:rFonts w:eastAsia="Calibri"/>
-                <w:color w:val="000000"/>
                 <w:sz w:val="28"/>
                 <w:szCs w:val="28"/>
               </w:rPr>
@@ -2552,7 +2506,6 @@
         <w:tc>
           <w:tcPr>
             <w:tcW w:w="2200" w:type="dxa"/>
-            <w:shd w:val="clear" w:color="auto" w:fill="FFFFFF"/>
             <w:tcMar>
               <w:top w:w="100" w:type="dxa"/>
               <w:left w:w="120" w:type="dxa"/>
@@ -2572,7 +2525,6 @@
                 <w:rFonts w:eastAsia="Calibri"/>
                 <w:b/>
                 <w:bCs/>
-                <w:color w:val="000000"/>
                 <w:sz w:val="28"/>
                 <w:szCs w:val="28"/>
               </w:rPr>
@@ -2583,7 +2535,6 @@
         <w:tc>
           <w:tcPr>
             <w:tcW w:w="2500" w:type="dxa"/>
-            <w:shd w:val="clear" w:color="auto" w:fill="FFFFFF"/>
             <w:tcMar>
               <w:top w:w="100" w:type="dxa"/>
               <w:left w:w="120" w:type="dxa"/>
@@ -2601,7 +2552,6 @@
             <w:r>
               <w:rPr>
                 <w:rFonts w:eastAsia="Calibri"/>
-                <w:color w:val="000000"/>
                 <w:sz w:val="28"/>
                 <w:szCs w:val="28"/>
               </w:rPr>
@@ -2612,7 +2562,6 @@
         <w:tc>
           <w:tcPr>
             <w:tcW w:w="2900" w:type="dxa"/>
-            <w:shd w:val="clear" w:color="auto" w:fill="FFFFFF"/>
             <w:tcMar>
               <w:top w:w="100" w:type="dxa"/>
               <w:left w:w="120" w:type="dxa"/>
@@ -2630,7 +2579,6 @@
             <w:r>
               <w:rPr>
                 <w:rFonts w:eastAsia="Calibri"/>
-                <w:color w:val="000000"/>
                 <w:sz w:val="28"/>
                 <w:szCs w:val="28"/>
               </w:rPr>
@@ -2641,7 +2589,6 @@
         <w:tc>
           <w:tcPr>
             <w:tcW w:w="3200" w:type="dxa"/>
-            <w:shd w:val="clear" w:color="auto" w:fill="FFFFFF"/>
             <w:tcMar>
               <w:top w:w="100" w:type="dxa"/>
               <w:left w:w="120" w:type="dxa"/>
@@ -2659,7 +2606,6 @@
             <w:r>
               <w:rPr>
                 <w:rFonts w:eastAsia="Calibri"/>
-                <w:color w:val="000000"/>
                 <w:sz w:val="28"/>
                 <w:szCs w:val="28"/>
               </w:rPr>
@@ -2672,7 +2618,6 @@
         <w:tc>
           <w:tcPr>
             <w:tcW w:w="2200" w:type="dxa"/>
-            <w:shd w:val="clear" w:color="auto" w:fill="FFFFFF"/>
             <w:tcMar>
               <w:top w:w="100" w:type="dxa"/>
               <w:left w:w="120" w:type="dxa"/>
@@ -2692,7 +2637,6 @@
                 <w:rFonts w:eastAsia="Calibri"/>
                 <w:b/>
                 <w:bCs/>
-                <w:color w:val="000000"/>
                 <w:sz w:val="28"/>
                 <w:szCs w:val="28"/>
               </w:rPr>
@@ -2703,7 +2647,6 @@
         <w:tc>
           <w:tcPr>
             <w:tcW w:w="2500" w:type="dxa"/>
-            <w:shd w:val="clear" w:color="auto" w:fill="FFFFFF"/>
             <w:tcMar>
               <w:top w:w="100" w:type="dxa"/>
               <w:left w:w="120" w:type="dxa"/>
@@ -2721,7 +2664,6 @@
             <w:r>
               <w:rPr>
                 <w:rFonts w:eastAsia="Calibri"/>
-                <w:color w:val="000000"/>
                 <w:sz w:val="28"/>
                 <w:szCs w:val="28"/>
               </w:rPr>
@@ -2731,7 +2673,6 @@
             <w:r>
               <w:rPr>
                 <w:rFonts w:eastAsia="Calibri"/>
-                <w:color w:val="000000"/>
                 <w:sz w:val="28"/>
                 <w:szCs w:val="28"/>
               </w:rPr>
@@ -2741,7 +2682,6 @@
             <w:r>
               <w:rPr>
                 <w:rFonts w:eastAsia="Calibri"/>
-                <w:color w:val="000000"/>
                 <w:sz w:val="28"/>
                 <w:szCs w:val="28"/>
               </w:rPr>
@@ -2752,7 +2692,6 @@
         <w:tc>
           <w:tcPr>
             <w:tcW w:w="2900" w:type="dxa"/>
-            <w:shd w:val="clear" w:color="auto" w:fill="FFFFFF"/>
             <w:tcMar>
               <w:top w:w="100" w:type="dxa"/>
               <w:left w:w="120" w:type="dxa"/>
@@ -2770,7 +2709,6 @@
             <w:r>
               <w:rPr>
                 <w:rFonts w:eastAsia="Calibri"/>
-                <w:color w:val="000000"/>
                 <w:sz w:val="28"/>
                 <w:szCs w:val="28"/>
               </w:rPr>
@@ -2781,7 +2719,6 @@
         <w:tc>
           <w:tcPr>
             <w:tcW w:w="3200" w:type="dxa"/>
-            <w:shd w:val="clear" w:color="auto" w:fill="FFFFFF"/>
             <w:tcMar>
               <w:top w:w="100" w:type="dxa"/>
               <w:left w:w="120" w:type="dxa"/>
@@ -2799,7 +2736,6 @@
             <w:r>
               <w:rPr>
                 <w:rFonts w:eastAsia="Calibri"/>
-                <w:color w:val="000000"/>
                 <w:sz w:val="28"/>
                 <w:szCs w:val="28"/>
               </w:rPr>
@@ -2812,7 +2748,6 @@
         <w:tc>
           <w:tcPr>
             <w:tcW w:w="2200" w:type="dxa"/>
-            <w:shd w:val="clear" w:color="auto" w:fill="FFFFFF"/>
             <w:tcMar>
               <w:top w:w="100" w:type="dxa"/>
               <w:left w:w="120" w:type="dxa"/>
@@ -2832,7 +2767,6 @@
                 <w:rFonts w:eastAsia="Calibri"/>
                 <w:b/>
                 <w:bCs/>
-                <w:color w:val="000000"/>
                 <w:sz w:val="28"/>
                 <w:szCs w:val="28"/>
               </w:rPr>
@@ -2843,7 +2777,6 @@
         <w:tc>
           <w:tcPr>
             <w:tcW w:w="2500" w:type="dxa"/>
-            <w:shd w:val="clear" w:color="auto" w:fill="FFFFFF"/>
             <w:tcMar>
               <w:top w:w="100" w:type="dxa"/>
               <w:left w:w="120" w:type="dxa"/>
@@ -2861,7 +2794,6 @@
             <w:r>
               <w:rPr>
                 <w:rFonts w:eastAsia="Calibri"/>
-                <w:color w:val="000000"/>
                 <w:sz w:val="28"/>
                 <w:szCs w:val="28"/>
               </w:rPr>
@@ -2872,7 +2804,6 @@
         <w:tc>
           <w:tcPr>
             <w:tcW w:w="2900" w:type="dxa"/>
-            <w:shd w:val="clear" w:color="auto" w:fill="FFFFFF"/>
             <w:tcMar>
               <w:top w:w="100" w:type="dxa"/>
               <w:left w:w="120" w:type="dxa"/>
@@ -2890,7 +2821,6 @@
             <w:r>
               <w:rPr>
                 <w:rFonts w:eastAsia="Calibri"/>
-                <w:color w:val="000000"/>
                 <w:sz w:val="28"/>
                 <w:szCs w:val="28"/>
               </w:rPr>
@@ -2901,7 +2831,6 @@
         <w:tc>
           <w:tcPr>
             <w:tcW w:w="3200" w:type="dxa"/>
-            <w:shd w:val="clear" w:color="auto" w:fill="FFFFFF"/>
             <w:tcMar>
               <w:top w:w="100" w:type="dxa"/>
               <w:left w:w="120" w:type="dxa"/>
@@ -2920,7 +2849,6 @@
             <w:r>
               <w:rPr>
                 <w:rFonts w:eastAsia="Calibri"/>
-                <w:color w:val="000000"/>
                 <w:sz w:val="28"/>
                 <w:szCs w:val="28"/>
               </w:rPr>
@@ -2930,7 +2858,6 @@
             <w:r>
               <w:rPr>
                 <w:rFonts w:eastAsia="Calibri"/>
-                <w:color w:val="000000"/>
                 <w:sz w:val="28"/>
                 <w:szCs w:val="28"/>
               </w:rPr>

</xml_diff>